<commit_message>
structured-tag pipeline is fixed
</commit_message>
<xml_diff>
--- a/docs/AQlibraryPlus_User_Manual.docx
+++ b/docs/AQlibraryPlus_User_Manual.docx
@@ -42,6 +42,10 @@
     <w:p>
       <w:pPr>
         <w:pStyle w:val="ListNumber"/>
+        <w:numPr>
+          <w:ilvl w:val="0"/>
+          <w:numId w:val="10"/>
+        </w:numPr>
       </w:pPr>
       <w:r>
         <w:t>What AQlibrary+ does</w:t>
@@ -50,6 +54,10 @@
     <w:p>
       <w:pPr>
         <w:pStyle w:val="ListNumber"/>
+        <w:numPr>
+          <w:ilvl w:val="0"/>
+          <w:numId w:val="10"/>
+        </w:numPr>
       </w:pPr>
       <w:r>
         <w:t>Key concepts</w:t>
@@ -58,6 +66,10 @@
     <w:p>
       <w:pPr>
         <w:pStyle w:val="ListNumber"/>
+        <w:numPr>
+          <w:ilvl w:val="0"/>
+          <w:numId w:val="10"/>
+        </w:numPr>
       </w:pPr>
       <w:r>
         <w:t>Quick start</w:t>
@@ -74,6 +86,10 @@
     <w:p>
       <w:pPr>
         <w:pStyle w:val="ListNumber"/>
+        <w:numPr>
+          <w:ilvl w:val="0"/>
+          <w:numId w:val="10"/>
+        </w:numPr>
       </w:pPr>
       <w:r>
         <w:t>Landing page</w:t>
@@ -82,6 +98,10 @@
     <w:p>
       <w:pPr>
         <w:pStyle w:val="ListNumber"/>
+        <w:numPr>
+          <w:ilvl w:val="0"/>
+          <w:numId w:val="10"/>
+        </w:numPr>
       </w:pPr>
       <w:r>
         <w:t>URL Collector</w:t>
@@ -90,6 +110,10 @@
     <w:p>
       <w:pPr>
         <w:pStyle w:val="ListNumber"/>
+        <w:numPr>
+          <w:ilvl w:val="0"/>
+          <w:numId w:val="10"/>
+        </w:numPr>
       </w:pPr>
       <w:r>
         <w:t>Saved URLs</w:t>
@@ -98,6 +122,10 @@
     <w:p>
       <w:pPr>
         <w:pStyle w:val="ListNumber"/>
+        <w:numPr>
+          <w:ilvl w:val="0"/>
+          <w:numId w:val="10"/>
+        </w:numPr>
       </w:pPr>
       <w:r>
         <w:t>File Manager</w:t>
@@ -106,6 +134,10 @@
     <w:p>
       <w:pPr>
         <w:pStyle w:val="ListNumber"/>
+        <w:numPr>
+          <w:ilvl w:val="0"/>
+          <w:numId w:val="10"/>
+        </w:numPr>
       </w:pPr>
       <w:r>
         <w:t>Notebook</w:t>
@@ -114,6 +146,10 @@
     <w:p>
       <w:pPr>
         <w:pStyle w:val="ListNumber"/>
+        <w:numPr>
+          <w:ilvl w:val="0"/>
+          <w:numId w:val="10"/>
+        </w:numPr>
       </w:pPr>
       <w:r>
         <w:t>Governance Workspace</w:t>
@@ -122,6 +158,10 @@
     <w:p>
       <w:pPr>
         <w:pStyle w:val="ListNumber"/>
+        <w:numPr>
+          <w:ilvl w:val="0"/>
+          <w:numId w:val="10"/>
+        </w:numPr>
       </w:pPr>
       <w:r>
         <w:t>Evidence and AI safety</w:t>
@@ -130,6 +170,10 @@
     <w:p>
       <w:pPr>
         <w:pStyle w:val="ListNumber"/>
+        <w:numPr>
+          <w:ilvl w:val="0"/>
+          <w:numId w:val="10"/>
+        </w:numPr>
       </w:pPr>
       <w:r>
         <w:t>Ten-minute validation exercise</w:t>
@@ -138,6 +182,10 @@
     <w:p>
       <w:pPr>
         <w:pStyle w:val="ListNumber"/>
+        <w:numPr>
+          <w:ilvl w:val="0"/>
+          <w:numId w:val="10"/>
+        </w:numPr>
       </w:pPr>
       <w:r>
         <w:t>Operating and troubleshooting a local installation</w:t>
@@ -744,6 +792,10 @@
     <w:p>
       <w:pPr>
         <w:pStyle w:val="ListNumber"/>
+        <w:numPr>
+          <w:ilvl w:val="0"/>
+          <w:numId w:val="12"/>
+        </w:numPr>
       </w:pPr>
       <w:r>
         <w:t>Open the AQlibrary+ URL supplied by your administrator in a modern desktop browser.</w:t>
@@ -752,6 +804,10 @@
     <w:p>
       <w:pPr>
         <w:pStyle w:val="ListNumber"/>
+        <w:numPr>
+          <w:ilvl w:val="0"/>
+          <w:numId w:val="12"/>
+        </w:numPr>
       </w:pPr>
       <w:r>
         <w:t xml:space="preserve">Select </w:t>
@@ -778,6 +834,10 @@
     <w:p>
       <w:pPr>
         <w:pStyle w:val="ListNumber"/>
+        <w:numPr>
+          <w:ilvl w:val="0"/>
+          <w:numId w:val="12"/>
+        </w:numPr>
       </w:pPr>
       <w:r>
         <w:t xml:space="preserve">Create or select a </w:t>
@@ -795,6 +855,10 @@
     <w:p>
       <w:pPr>
         <w:pStyle w:val="ListNumber"/>
+        <w:numPr>
+          <w:ilvl w:val="0"/>
+          <w:numId w:val="12"/>
+        </w:numPr>
       </w:pPr>
       <w:r>
         <w:t>Run a search, review coverage, and save relevant results to the active purpose.</w:t>
@@ -803,6 +867,10 @@
     <w:p>
       <w:pPr>
         <w:pStyle w:val="ListNumber"/>
+        <w:numPr>
+          <w:ilvl w:val="0"/>
+          <w:numId w:val="12"/>
+        </w:numPr>
       </w:pPr>
       <w:r>
         <w:t xml:space="preserve">Open </w:t>
@@ -820,6 +888,10 @@
     <w:p>
       <w:pPr>
         <w:pStyle w:val="ListNumber"/>
+        <w:numPr>
+          <w:ilvl w:val="0"/>
+          <w:numId w:val="12"/>
+        </w:numPr>
       </w:pPr>
       <w:r>
         <w:t xml:space="preserve">Attach ready URLs or files to a </w:t>
@@ -837,6 +909,10 @@
     <w:p>
       <w:pPr>
         <w:pStyle w:val="ListNumber"/>
+        <w:numPr>
+          <w:ilvl w:val="0"/>
+          <w:numId w:val="12"/>
+        </w:numPr>
       </w:pPr>
       <w:r>
         <w:t xml:space="preserve">Use </w:t>
@@ -1233,6 +1309,10 @@
     <w:p>
       <w:pPr>
         <w:pStyle w:val="ListNumber"/>
+        <w:numPr>
+          <w:ilvl w:val="0"/>
+          <w:numId w:val="13"/>
+        </w:numPr>
       </w:pPr>
       <w:r>
         <w:t xml:space="preserve">Open </w:t>
@@ -1253,6 +1333,10 @@
     <w:p>
       <w:pPr>
         <w:pStyle w:val="ListNumber"/>
+        <w:numPr>
+          <w:ilvl w:val="0"/>
+          <w:numId w:val="13"/>
+        </w:numPr>
       </w:pPr>
       <w:r>
         <w:t xml:space="preserve">Confirm </w:t>
@@ -1273,6 +1357,10 @@
     <w:p>
       <w:pPr>
         <w:pStyle w:val="ListNumber"/>
+        <w:numPr>
+          <w:ilvl w:val="0"/>
+          <w:numId w:val="13"/>
+        </w:numPr>
       </w:pPr>
       <w:r>
         <w:t xml:space="preserve">Confirm </w:t>
@@ -1293,6 +1381,10 @@
     <w:p>
       <w:pPr>
         <w:pStyle w:val="ListNumber"/>
+        <w:numPr>
+          <w:ilvl w:val="0"/>
+          <w:numId w:val="13"/>
+        </w:numPr>
       </w:pPr>
       <w:r>
         <w:t>Run a small URL Collector search to verify Google credentials.</w:t>
@@ -1301,6 +1393,10 @@
     <w:p>
       <w:pPr>
         <w:pStyle w:val="ListNumber"/>
+        <w:numPr>
+          <w:ilvl w:val="0"/>
+          <w:numId w:val="13"/>
+        </w:numPr>
       </w:pPr>
       <w:r>
         <w:t xml:space="preserve">Use </w:t>
@@ -2048,6 +2144,10 @@
     <w:p>
       <w:pPr>
         <w:pStyle w:val="ListNumber"/>
+        <w:numPr>
+          <w:ilvl w:val="0"/>
+          <w:numId w:val="14"/>
+        </w:numPr>
       </w:pPr>
       <w:r>
         <w:t>A CAQM direction or order defining C&amp;D dust-control obligations, such as Direction No. 79 dated 13 February 2024.</w:t>
@@ -2056,6 +2156,10 @@
     <w:p>
       <w:pPr>
         <w:pStyle w:val="ListNumber"/>
+        <w:numPr>
+          <w:ilvl w:val="0"/>
+          <w:numId w:val="14"/>
+        </w:numPr>
       </w:pPr>
       <w:r>
         <w:t>A CAQM, DPCC, CPCB, MCD, or GNCTD implementation or enforcement record describing monitoring, closure, environmental compensation, prosecution, portal registration, or another follow-up action.</w:t>
@@ -2064,6 +2168,10 @@
     <w:p>
       <w:pPr>
         <w:pStyle w:val="ListNumber"/>
+        <w:numPr>
+          <w:ilvl w:val="0"/>
+          <w:numId w:val="14"/>
+        </w:numPr>
       </w:pPr>
       <w:r>
         <w:t>A DPCC or CPCB report providing implementation, facility, inspection, or C&amp;D waste-management evidence, such as the DPCC annual report for 2023-2024.</w:t>
@@ -2227,6 +2335,10 @@
     <w:p>
       <w:pPr>
         <w:pStyle w:val="ListNumber"/>
+        <w:numPr>
+          <w:ilvl w:val="0"/>
+          <w:numId w:val="16"/>
+        </w:numPr>
       </w:pPr>
       <w:r>
         <w:t>Open the AQlibrary+ site in a modern desktop browser.</w:t>
@@ -2235,6 +2347,10 @@
     <w:p>
       <w:pPr>
         <w:pStyle w:val="ListNumber"/>
+        <w:numPr>
+          <w:ilvl w:val="0"/>
+          <w:numId w:val="16"/>
+        </w:numPr>
       </w:pPr>
       <w:r>
         <w:t xml:space="preserve">Select </w:t>
@@ -2252,6 +2368,10 @@
     <w:p>
       <w:pPr>
         <w:pStyle w:val="ListNumber"/>
+        <w:numPr>
+          <w:ilvl w:val="0"/>
+          <w:numId w:val="16"/>
+        </w:numPr>
       </w:pPr>
       <w:r>
         <w:t xml:space="preserve">Select </w:t>
@@ -2269,6 +2389,10 @@
     <w:p>
       <w:pPr>
         <w:pStyle w:val="ListNumber"/>
+        <w:numPr>
+          <w:ilvl w:val="0"/>
+          <w:numId w:val="16"/>
+        </w:numPr>
       </w:pPr>
       <w:r>
         <w:t xml:space="preserve">Use the application sidebar to move among </w:t>
@@ -2313,6 +2437,10 @@
     <w:p>
       <w:pPr>
         <w:pStyle w:val="ListNumber"/>
+        <w:numPr>
+          <w:ilvl w:val="0"/>
+          <w:numId w:val="16"/>
+        </w:numPr>
       </w:pPr>
       <w:r>
         <w:t xml:space="preserve">Select </w:t>
@@ -2330,6 +2458,10 @@
     <w:p>
       <w:pPr>
         <w:pStyle w:val="ListNumber"/>
+        <w:numPr>
+          <w:ilvl w:val="0"/>
+          <w:numId w:val="16"/>
+        </w:numPr>
       </w:pPr>
       <w:r>
         <w:t>Select the AQlibrary+ logo or the home link when available to return to the landing page.</w:t>
@@ -2351,6 +2483,10 @@
     <w:p>
       <w:pPr>
         <w:pStyle w:val="ListNumber"/>
+        <w:numPr>
+          <w:ilvl w:val="0"/>
+          <w:numId w:val="17"/>
+        </w:numPr>
       </w:pPr>
       <w:r>
         <w:t xml:space="preserve">Read the case brief in </w:t>
@@ -2365,6 +2501,10 @@
     <w:p>
       <w:pPr>
         <w:pStyle w:val="ListNumber"/>
+        <w:numPr>
+          <w:ilvl w:val="0"/>
+          <w:numId w:val="17"/>
+        </w:numPr>
       </w:pPr>
       <w:r>
         <w:t xml:space="preserve">From the landing page, select </w:t>
@@ -2391,6 +2531,10 @@
     <w:p>
       <w:pPr>
         <w:pStyle w:val="ListNumber"/>
+        <w:numPr>
+          <w:ilvl w:val="0"/>
+          <w:numId w:val="17"/>
+        </w:numPr>
       </w:pPr>
       <w:r>
         <w:t>Confirm that URL Collector opens. Use the application sidebar for every later page transition so the example remains one continuous workspace flow.</w:t>
@@ -2643,6 +2787,10 @@
     <w:p>
       <w:pPr>
         <w:pStyle w:val="ListNumber"/>
+        <w:numPr>
+          <w:ilvl w:val="0"/>
+          <w:numId w:val="19"/>
+        </w:numPr>
       </w:pPr>
       <w:r>
         <w:t xml:space="preserve">Open </w:t>
@@ -2660,6 +2808,10 @@
     <w:p>
       <w:pPr>
         <w:pStyle w:val="ListNumber"/>
+        <w:numPr>
+          <w:ilvl w:val="0"/>
+          <w:numId w:val="19"/>
+        </w:numPr>
       </w:pPr>
       <w:r>
         <w:t>In the Research Purpose area, select an existing purpose or create a new one. When creating one, enter a useful title and research question, then add jurisdiction, desired output, preferred domains, and relevant agencies when known.</w:t>
@@ -2668,6 +2820,10 @@
     <w:p>
       <w:pPr>
         <w:pStyle w:val="ListNumber"/>
+        <w:numPr>
+          <w:ilvl w:val="0"/>
+          <w:numId w:val="19"/>
+        </w:numPr>
       </w:pPr>
       <w:r>
         <w:t>Keep the intended purpose selected. Results cannot be saved to a purpose until one is active.</w:t>
@@ -2676,6 +2832,10 @@
     <w:p>
       <w:pPr>
         <w:pStyle w:val="ListNumber"/>
+        <w:numPr>
+          <w:ilvl w:val="0"/>
+          <w:numId w:val="19"/>
+        </w:numPr>
       </w:pPr>
       <w:r>
         <w:t xml:space="preserve">Optionally select </w:t>
@@ -2693,6 +2853,10 @@
     <w:p>
       <w:pPr>
         <w:pStyle w:val="ListNumber"/>
+        <w:numPr>
+          <w:ilvl w:val="0"/>
+          <w:numId w:val="19"/>
+        </w:numPr>
       </w:pPr>
       <w:r>
         <w:t>In the search form, enter a website only when the search must be restricted to that domain; otherwise leave it blank.</w:t>
@@ -2701,6 +2865,10 @@
     <w:p>
       <w:pPr>
         <w:pStyle w:val="ListNumber"/>
+        <w:numPr>
+          <w:ilvl w:val="0"/>
+          <w:numId w:val="19"/>
+        </w:numPr>
       </w:pPr>
       <w:r>
         <w:t xml:space="preserve">Enter the topic in </w:t>
@@ -2728,6 +2896,10 @@
     <w:p>
       <w:pPr>
         <w:pStyle w:val="ListNumber"/>
+        <w:numPr>
+          <w:ilvl w:val="0"/>
+          <w:numId w:val="19"/>
+        </w:numPr>
       </w:pPr>
       <w:r>
         <w:t xml:space="preserve">Optionally select </w:t>
@@ -2745,6 +2917,10 @@
     <w:p>
       <w:pPr>
         <w:pStyle w:val="ListNumber"/>
+        <w:numPr>
+          <w:ilvl w:val="0"/>
+          <w:numId w:val="19"/>
+        </w:numPr>
       </w:pPr>
       <w:r>
         <w:t xml:space="preserve">Set </w:t>
@@ -2771,6 +2947,10 @@
     <w:p>
       <w:pPr>
         <w:pStyle w:val="ListNumber"/>
+        <w:numPr>
+          <w:ilvl w:val="0"/>
+          <w:numId w:val="19"/>
+        </w:numPr>
       </w:pPr>
       <w:r>
         <w:t xml:space="preserve">Select </w:t>
@@ -2788,6 +2968,10 @@
     <w:p>
       <w:pPr>
         <w:pStyle w:val="ListNumber"/>
+        <w:numPr>
+          <w:ilvl w:val="0"/>
+          <w:numId w:val="19"/>
+        </w:numPr>
       </w:pPr>
       <w:r>
         <w:t xml:space="preserve">Review the </w:t>
@@ -2805,6 +2989,10 @@
     <w:p>
       <w:pPr>
         <w:pStyle w:val="ListNumber"/>
+        <w:numPr>
+          <w:ilvl w:val="0"/>
+          <w:numId w:val="19"/>
+        </w:numPr>
       </w:pPr>
       <w:r>
         <w:t>Filter the loaded results by domain or saved state, hide duplicates if needed, and sort the current result set.</w:t>
@@ -2813,6 +3001,10 @@
     <w:p>
       <w:pPr>
         <w:pStyle w:val="ListNumber"/>
+        <w:numPr>
+          <w:ilvl w:val="0"/>
+          <w:numId w:val="19"/>
+        </w:numPr>
       </w:pPr>
       <w:r>
         <w:t>Open promising results in their source sites and verify relevance before saving them.</w:t>
@@ -2821,6 +3013,10 @@
     <w:p>
       <w:pPr>
         <w:pStyle w:val="ListNumber"/>
+        <w:numPr>
+          <w:ilvl w:val="0"/>
+          <w:numId w:val="19"/>
+        </w:numPr>
       </w:pPr>
       <w:r>
         <w:t xml:space="preserve">Save one result with </w:t>
@@ -2847,6 +3043,10 @@
     <w:p>
       <w:pPr>
         <w:pStyle w:val="ListNumber"/>
+        <w:numPr>
+          <w:ilvl w:val="0"/>
+          <w:numId w:val="19"/>
+        </w:numPr>
       </w:pPr>
       <w:r>
         <w:t xml:space="preserve">For a URL already present in the registry, use </w:t>
@@ -2873,6 +3073,10 @@
     <w:p>
       <w:pPr>
         <w:pStyle w:val="ListNumber"/>
+        <w:numPr>
+          <w:ilvl w:val="0"/>
+          <w:numId w:val="19"/>
+        </w:numPr>
       </w:pPr>
       <w:r>
         <w:t xml:space="preserve">Open </w:t>
@@ -2903,6 +3107,10 @@
     <w:p>
       <w:pPr>
         <w:pStyle w:val="ListNumber"/>
+        <w:numPr>
+          <w:ilvl w:val="0"/>
+          <w:numId w:val="20"/>
+        </w:numPr>
       </w:pPr>
       <w:r>
         <w:t>Create a Research Purpose using the values in Section 3.4:</w:t>
@@ -3037,6 +3245,10 @@
     <w:p>
       <w:pPr>
         <w:pStyle w:val="ListNumber"/>
+        <w:numPr>
+          <w:ilvl w:val="0"/>
+          <w:numId w:val="20"/>
+        </w:numPr>
       </w:pPr>
       <w:r>
         <w:t xml:space="preserve">Keep that purpose selected. If </w:t>
@@ -3054,6 +3266,10 @@
     <w:p>
       <w:pPr>
         <w:pStyle w:val="ListNumber"/>
+        <w:numPr>
+          <w:ilvl w:val="0"/>
+          <w:numId w:val="20"/>
+        </w:numPr>
       </w:pPr>
       <w:r>
         <w:t>Run these focused searches separately rather than forcing every concept into one query:</w:t>
@@ -3260,6 +3476,10 @@
     <w:p>
       <w:pPr>
         <w:pStyle w:val="ListNumber"/>
+        <w:numPr>
+          <w:ilvl w:val="0"/>
+          <w:numId w:val="20"/>
+        </w:numPr>
       </w:pPr>
       <w:r>
         <w:t>Inspect the built query and Coverage check after each search. A missing source family is a reason to run another focused search, not evidence that the agency took no action.</w:t>
@@ -3268,6 +3488,10 @@
     <w:p>
       <w:pPr>
         <w:pStyle w:val="ListNumber"/>
+        <w:numPr>
+          <w:ilvl w:val="0"/>
+          <w:numId w:val="20"/>
+        </w:numPr>
       </w:pPr>
       <w:r>
         <w:t>Open candidate results on their official sites. Confirm the issuing organisation, document title, date, geographic scope, and whether the item is a direction, implementation record, or report.</w:t>
@@ -3276,6 +3500,10 @@
     <w:p>
       <w:pPr>
         <w:pStyle w:val="ListNumber"/>
+        <w:numPr>
+          <w:ilvl w:val="0"/>
+          <w:numId w:val="20"/>
+        </w:numPr>
       </w:pPr>
       <w:r>
         <w:t>Save at least one verified source for each of the three target evidence roles to the active purpose. Prefer the official document page or PDF over a search-result copy, repost, or news summary.</w:t>
@@ -3284,6 +3512,10 @@
     <w:p>
       <w:pPr>
         <w:pStyle w:val="ListNumber"/>
+        <w:numPr>
+          <w:ilvl w:val="0"/>
+          <w:numId w:val="20"/>
+        </w:numPr>
       </w:pPr>
       <w:r>
         <w:t>If a named target is absent, save an equivalent official record and note what it replaces when you reach Saved URLs.</w:t>
@@ -3292,6 +3524,10 @@
     <w:p>
       <w:pPr>
         <w:pStyle w:val="ListNumber"/>
+        <w:numPr>
+          <w:ilvl w:val="0"/>
+          <w:numId w:val="20"/>
+        </w:numPr>
       </w:pPr>
       <w:r>
         <w:t xml:space="preserve">Open </w:t>
@@ -3652,6 +3888,10 @@
     <w:p>
       <w:pPr>
         <w:pStyle w:val="ListNumber"/>
+        <w:numPr>
+          <w:ilvl w:val="0"/>
+          <w:numId w:val="23"/>
+        </w:numPr>
       </w:pPr>
       <w:r>
         <w:t xml:space="preserve">Open </w:t>
@@ -3669,6 +3909,10 @@
     <w:p>
       <w:pPr>
         <w:pStyle w:val="ListNumber"/>
+        <w:numPr>
+          <w:ilvl w:val="0"/>
+          <w:numId w:val="23"/>
+        </w:numPr>
       </w:pPr>
       <w:r>
         <w:t xml:space="preserve">Choose a Research Purpose in the purpose-intake controls, or choose </w:t>
@@ -3686,6 +3930,10 @@
     <w:p>
       <w:pPr>
         <w:pStyle w:val="ListNumber"/>
+        <w:numPr>
+          <w:ilvl w:val="0"/>
+          <w:numId w:val="23"/>
+        </w:numPr>
       </w:pPr>
       <w:r>
         <w:t xml:space="preserve">If the task is operational cleanup, select a review queue such as </w:t>
@@ -3739,6 +3987,10 @@
     <w:p>
       <w:pPr>
         <w:pStyle w:val="ListNumber"/>
+        <w:numPr>
+          <w:ilvl w:val="0"/>
+          <w:numId w:val="23"/>
+        </w:numPr>
       </w:pPr>
       <w:r>
         <w:t>Apply domain, tag, date, favourite, capture-state, AI-state, metadata, visibility, year, or sort controls as needed.</w:t>
@@ -3747,6 +3999,10 @@
     <w:p>
       <w:pPr>
         <w:pStyle w:val="ListNumber"/>
+        <w:numPr>
+          <w:ilvl w:val="0"/>
+          <w:numId w:val="23"/>
+        </w:numPr>
       </w:pPr>
       <w:r>
         <w:t xml:space="preserve">Select </w:t>
@@ -3773,6 +4029,10 @@
     <w:p>
       <w:pPr>
         <w:pStyle w:val="ListNumber"/>
+        <w:numPr>
+          <w:ilvl w:val="0"/>
+          <w:numId w:val="23"/>
+        </w:numPr>
       </w:pPr>
       <w:r>
         <w:t xml:space="preserve">Switch between </w:t>
@@ -3799,6 +4059,10 @@
     <w:p>
       <w:pPr>
         <w:pStyle w:val="ListNumber"/>
+        <w:numPr>
+          <w:ilvl w:val="0"/>
+          <w:numId w:val="23"/>
+        </w:numPr>
       </w:pPr>
       <w:r>
         <w:t xml:space="preserve">To add a known link without running discovery again, paste it into </w:t>
@@ -3816,6 +4080,10 @@
     <w:p>
       <w:pPr>
         <w:pStyle w:val="ListNumber"/>
+        <w:numPr>
+          <w:ilvl w:val="0"/>
+          <w:numId w:val="23"/>
+        </w:numPr>
       </w:pPr>
       <w:r>
         <w:t xml:space="preserve">Open a recordâ€™s </w:t>
@@ -3833,6 +4101,10 @@
     <w:p>
       <w:pPr>
         <w:pStyle w:val="ListNumber"/>
+        <w:numPr>
+          <w:ilvl w:val="0"/>
+          <w:numId w:val="23"/>
+        </w:numPr>
       </w:pPr>
       <w:r>
         <w:t>To preserve the page, choose its Text capture or PDF capture action. Text prioritises searchable content; PDF prioritises visual form.</w:t>
@@ -3841,6 +4113,10 @@
     <w:p>
       <w:pPr>
         <w:pStyle w:val="ListNumber"/>
+        <w:numPr>
+          <w:ilvl w:val="0"/>
+          <w:numId w:val="23"/>
+        </w:numPr>
       </w:pPr>
       <w:r>
         <w:t>In the destination picker, select the File Manager folder and confirm the capture. Wait for success before assuming that a durable copy exists.</w:t>
@@ -3849,6 +4125,10 @@
     <w:p>
       <w:pPr>
         <w:pStyle w:val="ListNumber"/>
+        <w:numPr>
+          <w:ilvl w:val="0"/>
+          <w:numId w:val="23"/>
+        </w:numPr>
       </w:pPr>
       <w:r>
         <w:t>Reopen the record or refresh the registry to confirm the capture status and stored-file link.</w:t>
@@ -3857,6 +4137,10 @@
     <w:p>
       <w:pPr>
         <w:pStyle w:val="ListNumber"/>
+        <w:numPr>
+          <w:ilvl w:val="0"/>
+          <w:numId w:val="23"/>
+        </w:numPr>
       </w:pPr>
       <w:r>
         <w:t>For several records, select their checkboxes and use only the bulk actions offered by the toolbar. Available actions depend on selection and current view and may include export, collection assignment, favourite, tagging, capture, or deletion.</w:t>
@@ -3865,6 +4149,10 @@
     <w:p>
       <w:pPr>
         <w:pStyle w:val="ListNumber"/>
+        <w:numPr>
+          <w:ilvl w:val="0"/>
+          <w:numId w:val="23"/>
+        </w:numPr>
       </w:pPr>
       <w:r>
         <w:t xml:space="preserve">Use </w:t>
@@ -3891,6 +4179,10 @@
     <w:p>
       <w:pPr>
         <w:pStyle w:val="ListNumber"/>
+        <w:numPr>
+          <w:ilvl w:val="0"/>
+          <w:numId w:val="23"/>
+        </w:numPr>
       </w:pPr>
       <w:r>
         <w:t xml:space="preserve">Open </w:t>
@@ -3916,6 +4208,10 @@
     <w:p>
       <w:pPr>
         <w:pStyle w:val="ListNumber"/>
+        <w:numPr>
+          <w:ilvl w:val="0"/>
+          <w:numId w:val="24"/>
+        </w:numPr>
       </w:pPr>
       <w:r>
         <w:t xml:space="preserve">Select the Research Purpose </w:t>
@@ -3934,6 +4230,10 @@
     <w:p>
       <w:pPr>
         <w:pStyle w:val="ListNumber"/>
+        <w:numPr>
+          <w:ilvl w:val="0"/>
+          <w:numId w:val="24"/>
+        </w:numPr>
       </w:pPr>
       <w:r>
         <w:t xml:space="preserve">Create the Saved URL collection </w:t>
@@ -3952,6 +4252,10 @@
     <w:p>
       <w:pPr>
         <w:pStyle w:val="ListNumber"/>
+        <w:numPr>
+          <w:ilvl w:val="0"/>
+          <w:numId w:val="24"/>
+        </w:numPr>
       </w:pPr>
       <w:r>
         <w:t xml:space="preserve">Open each recordâ€™s </w:t>
@@ -3969,6 +4273,10 @@
     <w:p>
       <w:pPr>
         <w:pStyle w:val="ListNumber"/>
+        <w:numPr>
+          <w:ilvl w:val="0"/>
+          <w:numId w:val="24"/>
+        </w:numPr>
       </w:pPr>
       <w:r>
         <w:t xml:space="preserve">Add the core tags </w:t>
@@ -4057,6 +4365,10 @@
     <w:p>
       <w:pPr>
         <w:pStyle w:val="ListNumber"/>
+        <w:numPr>
+          <w:ilvl w:val="0"/>
+          <w:numId w:val="24"/>
+        </w:numPr>
       </w:pPr>
       <w:r>
         <w:t xml:space="preserve">Capture the CAQM direction or order as PDF into </w:t>
@@ -4075,6 +4387,10 @@
     <w:p>
       <w:pPr>
         <w:pStyle w:val="ListNumber"/>
+        <w:numPr>
+          <w:ilvl w:val="0"/>
+          <w:numId w:val="24"/>
+        </w:numPr>
       </w:pPr>
       <w:r>
         <w:t xml:space="preserve">Capture official explanatory or enforcement web pages as Text when searchable page content is the important evidence. Capture attached formal reports as PDF into </w:t>
@@ -4093,6 +4409,10 @@
     <w:p>
       <w:pPr>
         <w:pStyle w:val="ListNumber"/>
+        <w:numPr>
+          <w:ilvl w:val="0"/>
+          <w:numId w:val="24"/>
+        </w:numPr>
       </w:pPr>
       <w:r>
         <w:t>Wait for each capture to report success, then confirm its stored-file link. Do not count a queued, failed, or merely saved URL as preserved evidence.</w:t>
@@ -4101,6 +4421,10 @@
     <w:p>
       <w:pPr>
         <w:pStyle w:val="ListNumber"/>
+        <w:numPr>
+          <w:ilvl w:val="0"/>
+          <w:numId w:val="24"/>
+        </w:numPr>
       </w:pPr>
       <w:r>
         <w:t>If an official server blocks capture, do not bypass the restriction. Download an authorised public copy through the browser, upload it in File Manager, preserve the source URL in the available metadata or notes, and record that it replaced the blocked automated capture.</w:t>
@@ -4109,6 +4433,10 @@
     <w:p>
       <w:pPr>
         <w:pStyle w:val="ListNumber"/>
+        <w:numPr>
+          <w:ilvl w:val="0"/>
+          <w:numId w:val="24"/>
+        </w:numPr>
       </w:pPr>
       <w:r>
         <w:t xml:space="preserve">Open </w:t>
@@ -4572,6 +4900,10 @@
     <w:p>
       <w:pPr>
         <w:pStyle w:val="ListNumber"/>
+        <w:numPr>
+          <w:ilvl w:val="0"/>
+          <w:numId w:val="27"/>
+        </w:numPr>
       </w:pPr>
       <w:r>
         <w:t xml:space="preserve">Open </w:t>
@@ -4589,6 +4921,10 @@
     <w:p>
       <w:pPr>
         <w:pStyle w:val="ListNumber"/>
+        <w:numPr>
+          <w:ilvl w:val="0"/>
+          <w:numId w:val="27"/>
+        </w:numPr>
       </w:pPr>
       <w:r>
         <w:t xml:space="preserve">In the left sidebar, choose </w:t>
@@ -4624,6 +4960,10 @@
     <w:p>
       <w:pPr>
         <w:pStyle w:val="ListNumber"/>
+        <w:numPr>
+          <w:ilvl w:val="0"/>
+          <w:numId w:val="27"/>
+        </w:numPr>
       </w:pPr>
       <w:r>
         <w:t xml:space="preserve">To create a location, remain in the normal Drive view, select </w:t>
@@ -4641,6 +4981,10 @@
     <w:p>
       <w:pPr>
         <w:pStyle w:val="ListNumber"/>
+        <w:numPr>
+          <w:ilvl w:val="0"/>
+          <w:numId w:val="27"/>
+        </w:numPr>
       </w:pPr>
       <w:r>
         <w:t xml:space="preserve">Open the intended destination folder before uploading. Select </w:t>
@@ -4658,6 +5002,10 @@
     <w:p>
       <w:pPr>
         <w:pStyle w:val="ListNumber"/>
+        <w:numPr>
+          <w:ilvl w:val="0"/>
+          <w:numId w:val="27"/>
+        </w:numPr>
       </w:pPr>
       <w:r>
         <w:t xml:space="preserve">Switch among </w:t>
@@ -4702,6 +5050,10 @@
     <w:p>
       <w:pPr>
         <w:pStyle w:val="ListNumber"/>
+        <w:numPr>
+          <w:ilvl w:val="0"/>
+          <w:numId w:val="27"/>
+        </w:numPr>
       </w:pPr>
       <w:r>
         <w:t>Use search to narrow the current drive, folder, favourites, trash, or archive scope shown by the interface.</w:t>
@@ -4710,6 +5062,10 @@
     <w:p>
       <w:pPr>
         <w:pStyle w:val="ListNumber"/>
+        <w:numPr>
+          <w:ilvl w:val="0"/>
+          <w:numId w:val="27"/>
+        </w:numPr>
       </w:pPr>
       <w:r>
         <w:t xml:space="preserve">Open </w:t>
@@ -4727,6 +5083,10 @@
     <w:p>
       <w:pPr>
         <w:pStyle w:val="ListNumber"/>
+        <w:numPr>
+          <w:ilvl w:val="0"/>
+          <w:numId w:val="27"/>
+        </w:numPr>
       </w:pPr>
       <w:r>
         <w:t xml:space="preserve">Use </w:t>
@@ -4753,6 +5113,10 @@
     <w:p>
       <w:pPr>
         <w:pStyle w:val="ListNumber"/>
+        <w:numPr>
+          <w:ilvl w:val="0"/>
+          <w:numId w:val="27"/>
+        </w:numPr>
       </w:pPr>
       <w:r>
         <w:t>Select a file to preview it. If inline preview is unsupported, use the available download action instead.</w:t>
@@ -4761,6 +5125,10 @@
     <w:p>
       <w:pPr>
         <w:pStyle w:val="ListNumber"/>
+        <w:numPr>
+          <w:ilvl w:val="0"/>
+          <w:numId w:val="27"/>
+        </w:numPr>
       </w:pPr>
       <w:r>
         <w:t xml:space="preserve">Open </w:t>
@@ -4787,6 +5155,10 @@
     <w:p>
       <w:pPr>
         <w:pStyle w:val="ListNumber"/>
+        <w:numPr>
+          <w:ilvl w:val="0"/>
+          <w:numId w:val="27"/>
+        </w:numPr>
       </w:pPr>
       <w:r>
         <w:t>Use row, card, context-menu, or command-bar actions to favourite, rename, duplicate, move, tag, or move items to Trash. The exact actions shown depend on the selected item and view.</w:t>
@@ -4795,6 +5167,10 @@
     <w:p>
       <w:pPr>
         <w:pStyle w:val="ListNumber"/>
+        <w:numPr>
+          <w:ilvl w:val="0"/>
+          <w:numId w:val="27"/>
+        </w:numPr>
       </w:pPr>
       <w:r>
         <w:t>For multi-item work, select the relevant checkboxes and use the bulk actions that become enabled; do not assume every single-item action supports bulk use.</w:t>
@@ -4803,6 +5179,10 @@
     <w:p>
       <w:pPr>
         <w:pStyle w:val="ListNumber"/>
+        <w:numPr>
+          <w:ilvl w:val="0"/>
+          <w:numId w:val="27"/>
+        </w:numPr>
       </w:pPr>
       <w:r>
         <w:t xml:space="preserve">If an item was removed accidentally, open </w:t>
@@ -4838,6 +5218,10 @@
     <w:p>
       <w:pPr>
         <w:pStyle w:val="ListNumber"/>
+        <w:numPr>
+          <w:ilvl w:val="0"/>
+          <w:numId w:val="27"/>
+        </w:numPr>
       </w:pPr>
       <w:r>
         <w:t xml:space="preserve">When a file is ready for analysis, use its Notebook action or open Notebook and choose </w:t>
@@ -4863,6 +5247,10 @@
     <w:p>
       <w:pPr>
         <w:pStyle w:val="ListNumber"/>
+        <w:numPr>
+          <w:ilvl w:val="0"/>
+          <w:numId w:val="28"/>
+        </w:numPr>
       </w:pPr>
       <w:r>
         <w:t xml:space="preserve">In the normal Drive view, create the folder </w:t>
@@ -4881,6 +5269,10 @@
     <w:p>
       <w:pPr>
         <w:pStyle w:val="ListNumber"/>
+        <w:numPr>
+          <w:ilvl w:val="0"/>
+          <w:numId w:val="28"/>
+        </w:numPr>
       </w:pPr>
       <w:r>
         <w:t xml:space="preserve">Inside it, confirm or create the subfolders </w:t>
@@ -4909,6 +5301,10 @@
     <w:p>
       <w:pPr>
         <w:pStyle w:val="ListNumber"/>
+        <w:numPr>
+          <w:ilvl w:val="0"/>
+          <w:numId w:val="28"/>
+        </w:numPr>
       </w:pPr>
       <w:r>
         <w:t>If a capture was blocked, open the correct subfolder, upload the authorised copy, and give it a descriptive name containing the issuing agency, document identifier or subject, and year. Do not imply that the uploaded file was captured automatically.</w:t>
@@ -4917,6 +5313,10 @@
     <w:p>
       <w:pPr>
         <w:pStyle w:val="ListNumber"/>
+        <w:numPr>
+          <w:ilvl w:val="0"/>
+          <w:numId w:val="28"/>
+        </w:numPr>
       </w:pPr>
       <w:r>
         <w:t xml:space="preserve">Open each fileâ€™s </w:t>
@@ -4943,6 +5343,10 @@
     <w:p>
       <w:pPr>
         <w:pStyle w:val="ListNumber"/>
+        <w:numPr>
+          <w:ilvl w:val="0"/>
+          <w:numId w:val="28"/>
+        </w:numPr>
       </w:pPr>
       <w:r>
         <w:t>Correct organisation or descriptive metadata using only the controls available. Do not alter source content to make records agree with one another.</w:t>
@@ -4951,6 +5355,10 @@
     <w:p>
       <w:pPr>
         <w:pStyle w:val="ListNumber"/>
+        <w:numPr>
+          <w:ilvl w:val="0"/>
+          <w:numId w:val="28"/>
+        </w:numPr>
       </w:pPr>
       <w:r>
         <w:t xml:space="preserve">Search the folder for </w:t>
@@ -4969,6 +5377,10 @@
     <w:p>
       <w:pPr>
         <w:pStyle w:val="ListNumber"/>
+        <w:numPr>
+          <w:ilvl w:val="0"/>
+          <w:numId w:val="28"/>
+        </w:numPr>
       </w:pPr>
       <w:r>
         <w:t>Wait for the files required for analysis to become Notebook-ready. If a source fails, open diagnostics and follow the existing extraction, OCR, ingestion, or indexing guidance before continuing.</w:t>
@@ -4977,6 +5389,10 @@
     <w:p>
       <w:pPr>
         <w:pStyle w:val="ListNumber"/>
+        <w:numPr>
+          <w:ilvl w:val="0"/>
+          <w:numId w:val="28"/>
+        </w:numPr>
       </w:pPr>
       <w:r>
         <w:t>Open Notebook and add files from these folders, or use an available file-level Notebook action.</w:t>
@@ -5336,6 +5752,10 @@
     <w:p>
       <w:pPr>
         <w:pStyle w:val="ListNumber"/>
+        <w:numPr>
+          <w:ilvl w:val="0"/>
+          <w:numId w:val="31"/>
+        </w:numPr>
       </w:pPr>
       <w:r>
         <w:t xml:space="preserve">Open </w:t>
@@ -5353,6 +5773,10 @@
     <w:p>
       <w:pPr>
         <w:pStyle w:val="ListNumber"/>
+        <w:numPr>
+          <w:ilvl w:val="0"/>
+          <w:numId w:val="31"/>
+        </w:numPr>
       </w:pPr>
       <w:r>
         <w:t>Create a new notebook or select an existing notebook, then rename it to match the project, case, or question.</w:t>
@@ -5361,6 +5785,10 @@
     <w:p>
       <w:pPr>
         <w:pStyle w:val="ListNumber"/>
+        <w:numPr>
+          <w:ilvl w:val="0"/>
+          <w:numId w:val="31"/>
+        </w:numPr>
       </w:pPr>
       <w:r>
         <w:t xml:space="preserve">Select </w:t>
@@ -5387,6 +5815,10 @@
     <w:p>
       <w:pPr>
         <w:pStyle w:val="ListNumber"/>
+        <w:numPr>
+          <w:ilvl w:val="0"/>
+          <w:numId w:val="31"/>
+        </w:numPr>
       </w:pPr>
       <w:r>
         <w:t xml:space="preserve">Review the Sources panel while ingestion and embeddings run. Essential sources must reach </w:t>
@@ -5404,6 +5836,10 @@
     <w:p>
       <w:pPr>
         <w:pStyle w:val="ListNumber"/>
+        <w:numPr>
+          <w:ilvl w:val="0"/>
+          <w:numId w:val="31"/>
+        </w:numPr>
       </w:pPr>
       <w:r>
         <w:t>If a source is stalled, failed, or not ready, open its diagnostics and use only the repair action offered for that source, such as retrying extraction, OCR, or indexing. Recheck its state afterward.</w:t>
@@ -5412,6 +5848,10 @@
     <w:p>
       <w:pPr>
         <w:pStyle w:val="ListNumber"/>
+        <w:numPr>
+          <w:ilvl w:val="0"/>
+          <w:numId w:val="31"/>
+        </w:numPr>
       </w:pPr>
       <w:r>
         <w:t xml:space="preserve">Mark relevant source cards </w:t>
@@ -5447,6 +5887,10 @@
     <w:p>
       <w:pPr>
         <w:pStyle w:val="ListNumber"/>
+        <w:numPr>
+          <w:ilvl w:val="0"/>
+          <w:numId w:val="31"/>
+        </w:numPr>
       </w:pPr>
       <w:r>
         <w:t xml:space="preserve">Choose </w:t>
@@ -5482,6 +5926,10 @@
     <w:p>
       <w:pPr>
         <w:pStyle w:val="ListNumber"/>
+        <w:numPr>
+          <w:ilvl w:val="0"/>
+          <w:numId w:val="31"/>
+        </w:numPr>
       </w:pPr>
       <w:r>
         <w:t>Ask a precise question that states the issue, jurisdiction, time range, output format, and evidence standard.</w:t>
@@ -5490,6 +5938,10 @@
     <w:p>
       <w:pPr>
         <w:pStyle w:val="ListNumber"/>
+        <w:numPr>
+          <w:ilvl w:val="0"/>
+          <w:numId w:val="31"/>
+        </w:numPr>
       </w:pPr>
       <w:r>
         <w:t>Read the answer and inspect its evidence blocks. Open every material citation in the source reader and compare the claim with the cited passage.</w:t>
@@ -5498,6 +5950,10 @@
     <w:p>
       <w:pPr>
         <w:pStyle w:val="ListNumber"/>
+        <w:numPr>
+          <w:ilvl w:val="0"/>
+          <w:numId w:val="31"/>
+        </w:numPr>
       </w:pPr>
       <w:r>
         <w:t>Refine the included-source scope or question when citations are weak, irrelevant, or incomplete; do not treat repeated prompting as a substitute for missing evidence.</w:t>
@@ -5506,6 +5962,10 @@
     <w:p>
       <w:pPr>
         <w:pStyle w:val="ListNumber"/>
+        <w:numPr>
+          <w:ilvl w:val="0"/>
+          <w:numId w:val="31"/>
+        </w:numPr>
       </w:pPr>
       <w:r>
         <w:t xml:space="preserve">Copy only verified findings into </w:t>
@@ -5523,6 +5983,10 @@
     <w:p>
       <w:pPr>
         <w:pStyle w:val="ListNumber"/>
+        <w:numPr>
+          <w:ilvl w:val="0"/>
+          <w:numId w:val="31"/>
+        </w:numPr>
       </w:pPr>
       <w:r>
         <w:t xml:space="preserve">Use </w:t>
@@ -5558,6 +6022,10 @@
     <w:p>
       <w:pPr>
         <w:pStyle w:val="ListNumber"/>
+        <w:numPr>
+          <w:ilvl w:val="0"/>
+          <w:numId w:val="31"/>
+        </w:numPr>
       </w:pPr>
       <w:r>
         <w:t>Remove a source from the notebook only when it should no longer belong to that notebook; use Excluded when it should merely be omitted from the current chat scope.</w:t>
@@ -5592,6 +6060,10 @@
     <w:p>
       <w:pPr>
         <w:pStyle w:val="ListNumber"/>
+        <w:numPr>
+          <w:ilvl w:val="0"/>
+          <w:numId w:val="32"/>
+        </w:numPr>
       </w:pPr>
       <w:r>
         <w:t xml:space="preserve">Create the Notebook </w:t>
@@ -5610,6 +6082,10 @@
     <w:p>
       <w:pPr>
         <w:pStyle w:val="ListNumber"/>
+        <w:numPr>
+          <w:ilvl w:val="0"/>
+          <w:numId w:val="32"/>
+        </w:numPr>
       </w:pPr>
       <w:r>
         <w:t xml:space="preserve">Add the formal direction and the implementation/reporting files from </w:t>
@@ -5628,6 +6104,10 @@
     <w:p>
       <w:pPr>
         <w:pStyle w:val="ListNumber"/>
+        <w:numPr>
+          <w:ilvl w:val="0"/>
+          <w:numId w:val="32"/>
+        </w:numPr>
       </w:pPr>
       <w:r>
         <w:t xml:space="preserve">Wait until every essential source is </w:t>
@@ -5654,6 +6134,10 @@
     <w:p>
       <w:pPr>
         <w:pStyle w:val="ListNumber"/>
+        <w:numPr>
+          <w:ilvl w:val="0"/>
+          <w:numId w:val="32"/>
+        </w:numPr>
       </w:pPr>
       <w:r>
         <w:t xml:space="preserve">Choose </w:t>
@@ -5676,6 +6160,10 @@
     <w:p>
       <w:pPr>
         <w:pStyle w:val="ListNumber"/>
+        <w:numPr>
+          <w:ilvl w:val="0"/>
+          <w:numId w:val="33"/>
+        </w:numPr>
       </w:pPr>
       <w:r>
         <w:t>Open every citation supporting a material table row. Confirm that the passage supports the date, actor, action, authority, and implementation statement attributed to it.</w:t>
@@ -5684,6 +6172,10 @@
     <w:p>
       <w:pPr>
         <w:pStyle w:val="ListNumber"/>
+        <w:numPr>
+          <w:ilvl w:val="0"/>
+          <w:numId w:val="33"/>
+        </w:numPr>
       </w:pPr>
       <w:r>
         <w:t>Remove or mark as unverified any row whose citation is absent, irrelevant, or weaker than the claim. If evidence is missing, add a better official source rather than repeatedly prompting for a stronger conclusion.</w:t>
@@ -5692,6 +6184,10 @@
     <w:p>
       <w:pPr>
         <w:pStyle w:val="ListNumber"/>
+        <w:numPr>
+          <w:ilvl w:val="0"/>
+          <w:numId w:val="33"/>
+        </w:numPr>
       </w:pPr>
       <w:r>
         <w:t xml:space="preserve">Copy the verified table, source substitutions, contradictions, and unresolved gaps into </w:t>
@@ -5719,6 +6215,10 @@
     <w:p>
       <w:pPr>
         <w:pStyle w:val="ListNumber"/>
+        <w:numPr>
+          <w:ilvl w:val="0"/>
+          <w:numId w:val="33"/>
+        </w:numPr>
       </w:pPr>
       <w:r>
         <w:t xml:space="preserve">Preserve a specific distinction in Notes between </w:t>
@@ -6122,6 +6622,10 @@
     <w:p>
       <w:pPr>
         <w:pStyle w:val="ListNumber"/>
+        <w:numPr>
+          <w:ilvl w:val="0"/>
+          <w:numId w:val="36"/>
+        </w:numPr>
       </w:pPr>
       <w:r>
         <w:t xml:space="preserve">Open </w:t>
@@ -6139,6 +6643,10 @@
     <w:p>
       <w:pPr>
         <w:pStyle w:val="ListNumber"/>
+        <w:numPr>
+          <w:ilvl w:val="0"/>
+          <w:numId w:val="36"/>
+        </w:numPr>
       </w:pPr>
       <w:r>
         <w:t xml:space="preserve">In </w:t>
@@ -6156,6 +6664,10 @@
     <w:p>
       <w:pPr>
         <w:pStyle w:val="ListNumber"/>
+        <w:numPr>
+          <w:ilvl w:val="0"/>
+          <w:numId w:val="36"/>
+        </w:numPr>
       </w:pPr>
       <w:r>
         <w:t>Set the question type, time window, issue hint, and location hint when known. These fields narrow retrieval and should reflect the question rather than anticipated conclusions.</w:t>
@@ -6164,6 +6676,10 @@
     <w:p>
       <w:pPr>
         <w:pStyle w:val="ListNumber"/>
+        <w:numPr>
+          <w:ilvl w:val="0"/>
+          <w:numId w:val="36"/>
+        </w:numPr>
       </w:pPr>
       <w:r>
         <w:t xml:space="preserve">Choose a workflow: </w:t>
@@ -6208,6 +6724,10 @@
     <w:p>
       <w:pPr>
         <w:pStyle w:val="ListNumber"/>
+        <w:numPr>
+          <w:ilvl w:val="0"/>
+          <w:numId w:val="36"/>
+        </w:numPr>
       </w:pPr>
       <w:r>
         <w:t xml:space="preserve">Set source scope to </w:t>
@@ -6243,6 +6763,10 @@
     <w:p>
       <w:pPr>
         <w:pStyle w:val="ListNumber"/>
+        <w:numPr>
+          <w:ilvl w:val="0"/>
+          <w:numId w:val="36"/>
+        </w:numPr>
       </w:pPr>
       <w:r>
         <w:t>Review any pinned file or URL anchors. Clear an accidental anchor before retrieval, or return to File Manager/Saved URLs when the necessary source has not yet been stored or captured.</w:t>
@@ -6251,6 +6775,10 @@
     <w:p>
       <w:pPr>
         <w:pStyle w:val="ListNumber"/>
+        <w:numPr>
+          <w:ilvl w:val="0"/>
+          <w:numId w:val="36"/>
+        </w:numPr>
       </w:pPr>
       <w:r>
         <w:t xml:space="preserve">Select </w:t>
@@ -6268,6 +6796,10 @@
     <w:p>
       <w:pPr>
         <w:pStyle w:val="ListNumber"/>
+        <w:numPr>
+          <w:ilvl w:val="0"/>
+          <w:numId w:val="36"/>
+        </w:numPr>
       </w:pPr>
       <w:r>
         <w:t>Review candidate titles, source type, metadata, provenance, and available evidence excerpts. Include relevant candidates and exclude irrelevant ones using the controls on each candidate.</w:t>
@@ -6276,6 +6808,10 @@
     <w:p>
       <w:pPr>
         <w:pStyle w:val="ListNumber"/>
+        <w:numPr>
+          <w:ilvl w:val="0"/>
+          <w:numId w:val="36"/>
+        </w:numPr>
       </w:pPr>
       <w:r>
         <w:t xml:space="preserve">Check coverage and gaps for missing agencies, periods, evidence families, or document types. Refine the question or broaden the source scope and run </w:t>
@@ -6293,6 +6829,10 @@
     <w:p>
       <w:pPr>
         <w:pStyle w:val="ListNumber"/>
+        <w:numPr>
+          <w:ilvl w:val="0"/>
+          <w:numId w:val="36"/>
+        </w:numPr>
       </w:pPr>
       <w:r>
         <w:t xml:space="preserve">Select </w:t>
@@ -6310,6 +6850,10 @@
     <w:p>
       <w:pPr>
         <w:pStyle w:val="ListNumber"/>
+        <w:numPr>
+          <w:ilvl w:val="0"/>
+          <w:numId w:val="36"/>
+        </w:numPr>
       </w:pPr>
       <w:r>
         <w:t>Inspect every material citation and its provenance. Distinguish statements present in sources from system-generated synthesis or inference.</w:t>
@@ -6318,6 +6862,10 @@
     <w:p>
       <w:pPr>
         <w:pStyle w:val="ListNumber"/>
+        <w:numPr>
+          <w:ilvl w:val="0"/>
+          <w:numId w:val="36"/>
+        </w:numPr>
       </w:pPr>
       <w:r>
         <w:t xml:space="preserve">Revisit earlier investigation sessions through </w:t>
@@ -6343,6 +6891,10 @@
     <w:p>
       <w:pPr>
         <w:pStyle w:val="ListNumber"/>
+        <w:numPr>
+          <w:ilvl w:val="0"/>
+          <w:numId w:val="37"/>
+        </w:numPr>
       </w:pPr>
       <w:r>
         <w:t>Launch Governance Workspace from the CAQM direction in File Manager or Saved URLs so that the direction appears as a pinned anchor. Confirm the anchor before retrieval.</w:t>
@@ -6351,6 +6903,10 @@
     <w:p>
       <w:pPr>
         <w:pStyle w:val="ListNumber"/>
+        <w:numPr>
+          <w:ilvl w:val="0"/>
+          <w:numId w:val="37"/>
+        </w:numPr>
       </w:pPr>
       <w:r>
         <w:t xml:space="preserve">Enter this question in </w:t>
@@ -6373,6 +6929,10 @@
     <w:p>
       <w:pPr>
         <w:pStyle w:val="ListNumber"/>
+        <w:numPr>
+          <w:ilvl w:val="0"/>
+          <w:numId w:val="38"/>
+        </w:numPr>
       </w:pPr>
       <w:r>
         <w:t xml:space="preserve">Set </w:t>
@@ -6455,6 +7015,10 @@
     <w:p>
       <w:pPr>
         <w:pStyle w:val="ListNumber"/>
+        <w:numPr>
+          <w:ilvl w:val="0"/>
+          <w:numId w:val="38"/>
+        </w:numPr>
       </w:pPr>
       <w:r>
         <w:t xml:space="preserve">Choose </w:t>
@@ -6490,6 +7054,10 @@
     <w:p>
       <w:pPr>
         <w:pStyle w:val="ListNumber"/>
+        <w:numPr>
+          <w:ilvl w:val="0"/>
+          <w:numId w:val="38"/>
+        </w:numPr>
       </w:pPr>
       <w:r>
         <w:t xml:space="preserve">Select </w:t>
@@ -6507,6 +7075,10 @@
     <w:p>
       <w:pPr>
         <w:pStyle w:val="ListNumber"/>
+        <w:numPr>
+          <w:ilvl w:val="0"/>
+          <w:numId w:val="38"/>
+        </w:numPr>
       </w:pPr>
       <w:r>
         <w:t>Inspect coverage before generation. If an agency, time period, or evidence role is missing, refine retrieval or return to the archive; do not interpret retrieval silence as proof of non-compliance.</w:t>
@@ -6515,6 +7087,10 @@
     <w:p>
       <w:pPr>
         <w:pStyle w:val="ListNumber"/>
+        <w:numPr>
+          <w:ilvl w:val="0"/>
+          <w:numId w:val="38"/>
+        </w:numPr>
       </w:pPr>
       <w:r>
         <w:t xml:space="preserve">Select </w:t>
@@ -6532,6 +7108,10 @@
     <w:p>
       <w:pPr>
         <w:pStyle w:val="ListNumber"/>
+        <w:numPr>
+          <w:ilvl w:val="0"/>
+          <w:numId w:val="38"/>
+        </w:numPr>
       </w:pPr>
       <w:r>
         <w:t>Open every citation supporting a claimed mandate, agency relationship, enforcement event, or gap. Compare those claims with the Notebookâ€™s verified table and record genuine conflicts rather than forcing alignment.</w:t>
@@ -6540,6 +7120,10 @@
     <w:p>
       <w:pPr>
         <w:pStyle w:val="ListNumber"/>
+        <w:numPr>
+          <w:ilvl w:val="0"/>
+          <w:numId w:val="38"/>
+        </w:numPr>
       </w:pPr>
       <w:r>
         <w:t xml:space="preserve">Reopen the investigation through </w:t>
@@ -6852,6 +7436,10 @@
     <w:p>
       <w:pPr>
         <w:pStyle w:val="ListNumber"/>
+        <w:numPr>
+          <w:ilvl w:val="0"/>
+          <w:numId w:val="41"/>
+        </w:numPr>
       </w:pPr>
       <w:r>
         <w:t>Open File Manager and upload one PDF into a test folder.</w:t>
@@ -6860,6 +7448,10 @@
     <w:p>
       <w:pPr>
         <w:pStyle w:val="ListNumber"/>
+        <w:numPr>
+          <w:ilvl w:val="0"/>
+          <w:numId w:val="41"/>
+        </w:numPr>
       </w:pPr>
       <w:r>
         <w:t>Select the file and confirm its name, origin, and preview or download action are available.</w:t>
@@ -6868,6 +7460,10 @@
     <w:p>
       <w:pPr>
         <w:pStyle w:val="ListNumber"/>
+        <w:numPr>
+          <w:ilvl w:val="0"/>
+          <w:numId w:val="41"/>
+        </w:numPr>
       </w:pPr>
       <w:r>
         <w:t xml:space="preserve">Create a Notebook named </w:t>
@@ -6886,6 +7482,10 @@
     <w:p>
       <w:pPr>
         <w:pStyle w:val="ListNumber"/>
+        <w:numPr>
+          <w:ilvl w:val="0"/>
+          <w:numId w:val="41"/>
+        </w:numPr>
       </w:pPr>
       <w:r>
         <w:t>Add the uploaded PDF as a source.</w:t>
@@ -6894,6 +7494,10 @@
     <w:p>
       <w:pPr>
         <w:pStyle w:val="ListNumber"/>
+        <w:numPr>
+          <w:ilvl w:val="0"/>
+          <w:numId w:val="41"/>
+        </w:numPr>
       </w:pPr>
       <w:r>
         <w:t xml:space="preserve">Wait until its status is </w:t>
@@ -6911,6 +7515,10 @@
     <w:p>
       <w:pPr>
         <w:pStyle w:val="ListNumber"/>
+        <w:numPr>
+          <w:ilvl w:val="0"/>
+          <w:numId w:val="41"/>
+        </w:numPr>
       </w:pPr>
       <w:r>
         <w:t xml:space="preserve">Confirm that the source is </w:t>
@@ -6928,6 +7536,10 @@
     <w:p>
       <w:pPr>
         <w:pStyle w:val="ListNumber"/>
+        <w:numPr>
+          <w:ilvl w:val="0"/>
+          <w:numId w:val="41"/>
+        </w:numPr>
       </w:pPr>
       <w:r>
         <w:t xml:space="preserve">Ask: </w:t>
@@ -6943,6 +7555,10 @@
     <w:p>
       <w:pPr>
         <w:pStyle w:val="ListNumber"/>
+        <w:numPr>
+          <w:ilvl w:val="0"/>
+          <w:numId w:val="41"/>
+        </w:numPr>
       </w:pPr>
       <w:r>
         <w:t>Open at least one citation and compare the answer with the source passage.</w:t>
@@ -6951,6 +7567,10 @@
     <w:p>
       <w:pPr>
         <w:pStyle w:val="ListNumber"/>
+        <w:numPr>
+          <w:ilvl w:val="0"/>
+          <w:numId w:val="41"/>
+        </w:numPr>
       </w:pPr>
       <w:r>
         <w:t>Save one verified finding to Notes.</w:t>
@@ -7895,6 +8515,198 @@
   </w:num>
   <w:num w:numId="9">
     <w:abstractNumId w:val="0"/>
+  </w:num>
+  <w:num w:numId="10">
+    <w:abstractNumId w:val="7"/>
+    <w:lvlOverride w:ilvl="0">
+      <w:startOverride w:val="1"/>
+    </w:lvlOverride>
+  </w:num>
+  <w:num w:numId="11">
+    <w:abstractNumId w:val="7"/>
+    <w:lvlOverride w:ilvl="0">
+      <w:startOverride w:val="1"/>
+    </w:lvlOverride>
+  </w:num>
+  <w:num w:numId="12">
+    <w:abstractNumId w:val="7"/>
+    <w:lvlOverride w:ilvl="0">
+      <w:startOverride w:val="1"/>
+    </w:lvlOverride>
+  </w:num>
+  <w:num w:numId="13">
+    <w:abstractNumId w:val="7"/>
+    <w:lvlOverride w:ilvl="0">
+      <w:startOverride w:val="1"/>
+    </w:lvlOverride>
+  </w:num>
+  <w:num w:numId="14">
+    <w:abstractNumId w:val="7"/>
+    <w:lvlOverride w:ilvl="0">
+      <w:startOverride w:val="1"/>
+    </w:lvlOverride>
+  </w:num>
+  <w:num w:numId="15">
+    <w:abstractNumId w:val="7"/>
+    <w:lvlOverride w:ilvl="0">
+      <w:startOverride w:val="1"/>
+    </w:lvlOverride>
+  </w:num>
+  <w:num w:numId="16">
+    <w:abstractNumId w:val="7"/>
+    <w:lvlOverride w:ilvl="0">
+      <w:startOverride w:val="1"/>
+    </w:lvlOverride>
+  </w:num>
+  <w:num w:numId="17">
+    <w:abstractNumId w:val="7"/>
+    <w:lvlOverride w:ilvl="0">
+      <w:startOverride w:val="1"/>
+    </w:lvlOverride>
+  </w:num>
+  <w:num w:numId="18">
+    <w:abstractNumId w:val="7"/>
+    <w:lvlOverride w:ilvl="0">
+      <w:startOverride w:val="1"/>
+    </w:lvlOverride>
+  </w:num>
+  <w:num w:numId="19">
+    <w:abstractNumId w:val="7"/>
+    <w:lvlOverride w:ilvl="0">
+      <w:startOverride w:val="1"/>
+    </w:lvlOverride>
+  </w:num>
+  <w:num w:numId="20">
+    <w:abstractNumId w:val="7"/>
+    <w:lvlOverride w:ilvl="0">
+      <w:startOverride w:val="1"/>
+    </w:lvlOverride>
+  </w:num>
+  <w:num w:numId="21">
+    <w:abstractNumId w:val="7"/>
+    <w:lvlOverride w:ilvl="0">
+      <w:startOverride w:val="1"/>
+    </w:lvlOverride>
+  </w:num>
+  <w:num w:numId="22">
+    <w:abstractNumId w:val="7"/>
+    <w:lvlOverride w:ilvl="0">
+      <w:startOverride w:val="1"/>
+    </w:lvlOverride>
+  </w:num>
+  <w:num w:numId="23">
+    <w:abstractNumId w:val="7"/>
+    <w:lvlOverride w:ilvl="0">
+      <w:startOverride w:val="1"/>
+    </w:lvlOverride>
+  </w:num>
+  <w:num w:numId="24">
+    <w:abstractNumId w:val="7"/>
+    <w:lvlOverride w:ilvl="0">
+      <w:startOverride w:val="1"/>
+    </w:lvlOverride>
+  </w:num>
+  <w:num w:numId="25">
+    <w:abstractNumId w:val="7"/>
+    <w:lvlOverride w:ilvl="0">
+      <w:startOverride w:val="1"/>
+    </w:lvlOverride>
+  </w:num>
+  <w:num w:numId="26">
+    <w:abstractNumId w:val="7"/>
+    <w:lvlOverride w:ilvl="0">
+      <w:startOverride w:val="1"/>
+    </w:lvlOverride>
+  </w:num>
+  <w:num w:numId="27">
+    <w:abstractNumId w:val="7"/>
+    <w:lvlOverride w:ilvl="0">
+      <w:startOverride w:val="1"/>
+    </w:lvlOverride>
+  </w:num>
+  <w:num w:numId="28">
+    <w:abstractNumId w:val="7"/>
+    <w:lvlOverride w:ilvl="0">
+      <w:startOverride w:val="1"/>
+    </w:lvlOverride>
+  </w:num>
+  <w:num w:numId="29">
+    <w:abstractNumId w:val="7"/>
+    <w:lvlOverride w:ilvl="0">
+      <w:startOverride w:val="1"/>
+    </w:lvlOverride>
+  </w:num>
+  <w:num w:numId="30">
+    <w:abstractNumId w:val="7"/>
+    <w:lvlOverride w:ilvl="0">
+      <w:startOverride w:val="1"/>
+    </w:lvlOverride>
+  </w:num>
+  <w:num w:numId="31">
+    <w:abstractNumId w:val="7"/>
+    <w:lvlOverride w:ilvl="0">
+      <w:startOverride w:val="1"/>
+    </w:lvlOverride>
+  </w:num>
+  <w:num w:numId="32">
+    <w:abstractNumId w:val="7"/>
+    <w:lvlOverride w:ilvl="0">
+      <w:startOverride w:val="1"/>
+    </w:lvlOverride>
+  </w:num>
+  <w:num w:numId="33">
+    <w:abstractNumId w:val="7"/>
+    <w:lvlOverride w:ilvl="0">
+      <w:startOverride w:val="1"/>
+    </w:lvlOverride>
+  </w:num>
+  <w:num w:numId="34">
+    <w:abstractNumId w:val="7"/>
+    <w:lvlOverride w:ilvl="0">
+      <w:startOverride w:val="1"/>
+    </w:lvlOverride>
+  </w:num>
+  <w:num w:numId="35">
+    <w:abstractNumId w:val="7"/>
+    <w:lvlOverride w:ilvl="0">
+      <w:startOverride w:val="1"/>
+    </w:lvlOverride>
+  </w:num>
+  <w:num w:numId="36">
+    <w:abstractNumId w:val="7"/>
+    <w:lvlOverride w:ilvl="0">
+      <w:startOverride w:val="1"/>
+    </w:lvlOverride>
+  </w:num>
+  <w:num w:numId="37">
+    <w:abstractNumId w:val="7"/>
+    <w:lvlOverride w:ilvl="0">
+      <w:startOverride w:val="1"/>
+    </w:lvlOverride>
+  </w:num>
+  <w:num w:numId="38">
+    <w:abstractNumId w:val="7"/>
+    <w:lvlOverride w:ilvl="0">
+      <w:startOverride w:val="1"/>
+    </w:lvlOverride>
+  </w:num>
+  <w:num w:numId="39">
+    <w:abstractNumId w:val="7"/>
+    <w:lvlOverride w:ilvl="0">
+      <w:startOverride w:val="1"/>
+    </w:lvlOverride>
+  </w:num>
+  <w:num w:numId="40">
+    <w:abstractNumId w:val="7"/>
+    <w:lvlOverride w:ilvl="0">
+      <w:startOverride w:val="1"/>
+    </w:lvlOverride>
+  </w:num>
+  <w:num w:numId="41">
+    <w:abstractNumId w:val="7"/>
+    <w:lvlOverride w:ilvl="0">
+      <w:startOverride w:val="1"/>
+    </w:lvlOverride>
   </w:num>
 </w:numbering>
 </file>

</xml_diff>